<commit_message>
Reactivates functions for endless potentiometers. Removes redundant functions. Rearranges variables.
</commit_message>
<xml_diff>
--- a/docs/Bedienungsanleitung_Potentiometer-Pruefstand.docx
+++ b/docs/Bedienungsanleitung_Potentiometer-Pruefstand.docx
@@ -1895,6 +1895,9 @@
       <w:r>
         <w:t>Prüfling nur bei stillgesetzter und spannungsfreier Vorrichtung montieren oder elektrisch anschließen.</w:t>
       </w:r>
+      <w:r>
+        <w:t xml:space="preserve"> Maximal 1080° Drehwinkel bei Potis mit mechanischen Endanschlag. </w:t>
+      </w:r>
     </w:p>
     <w:p>
       <w:pPr>
@@ -5638,6 +5641,7 @@
         <w:trPr>
           <w:gridAfter w:val="1"/>
           <w:wAfter w:w="331" w:type="dxa"/>
+          <w:trHeight w:val="50"/>
         </w:trPr>
         <w:tc>
           <w:tcPr>
@@ -5792,6 +5796,7 @@
               <w:rPr>
                 <w:sz w:val="18"/>
               </w:rPr>
+              <w:lastRenderedPageBreak/>
               <w:t>Relais switch</w:t>
             </w:r>
           </w:p>
@@ -7404,6 +7409,7 @@
               <w:rPr>
                 <w:sz w:val="18"/>
               </w:rPr>
+              <w:lastRenderedPageBreak/>
               <w:t>Relais 9 AB</w:t>
             </w:r>
           </w:p>
@@ -8163,6 +8169,7 @@
         <w:rPr>
           <w:b w:val="0"/>
         </w:rPr>
+        <w:lastRenderedPageBreak/>
         <w:t>9.4 Relevante Projektdateien</w:t>
       </w:r>
     </w:p>
@@ -9786,6 +9793,7 @@
         <w:rPr>
           <w:b w:val="0"/>
         </w:rPr>
+        <w:lastRenderedPageBreak/>
         <w:t>11 Außerbetriebnahme und Wartung</w:t>
       </w:r>
     </w:p>
@@ -11159,6 +11167,7 @@
               <w:rPr>
                 <w:sz w:val="18"/>
               </w:rPr>
+              <w:lastRenderedPageBreak/>
               <w:t>Alle Presets fachlich geprüft</w:t>
             </w:r>
           </w:p>

</xml_diff>